<commit_message>
Publish workspace from pulse-cluster @ 26ce3b6
Page built with --flat so pdf/ and the Markdown sources resolve from the
site root. Assets refreshed alongside it.
</commit_message>
<xml_diff>
--- a/pdf/PULSE-PLAN-002_Sprint_2_Backlog.docx
+++ b/pdf/PULSE-PLAN-002_Sprint_2_Backlog.docx
@@ -349,7 +349,7 @@
               <w:jc w:val="left"/>
             </w:pPr>
             <w:r>
-              <w:t xml:space="preserve">Gate</w:t>
+              <w:t xml:space="preserve">Review gate</w:t>
             </w:r>
           </w:p>
         </w:tc>
@@ -384,7 +384,7 @@
               <w:jc w:val="left"/>
             </w:pPr>
             <w:r>
-              <w:t xml:space="preserve">PULSE-StRS-001 section 3.1, PULSE-SyRS-001, PULSE-SAF-001, PULSE-SEC-001</w:t>
+              <w:t xml:space="preserve">PULSE-StRS-001, PULSE-SyRS-001, PULSE-SAF-001, PULSE-SEC-001</w:t>
             </w:r>
           </w:p>
         </w:tc>
@@ -547,7 +547,7 @@
         <w:pStyle w:val="FirstParagraph"/>
       </w:pPr>
       <w:r>
-        <w:t xml:space="preserve">Close work package 02: the signal layer and the Flutter cluster are verified on live broker data by an automated suite that runs before every demo, and the desk-only shortcuts that have a sprint 2 requirement attached are removed. The week 6 demo shows the same cluster as week 3, now with contract tests, degraded-state display, encrypted transport and pinned upstream versions behind it.</w:t>
+        <w:t xml:space="preserve">Close work package 02. An automated suite verifies the signal layer and the Flutter cluster against live broker data, and runs before every demo. Every desk-only shortcut that has a sprint 2 requirement attached is removed. The week 6 demo shows the same cluster as week 3, now with contract tests, degraded-state display, encrypted transport and pinned upstream versions behind it.</w:t>
       </w:r>
     </w:p>
     <w:p>
@@ -1299,7 +1299,7 @@
               <w:jc w:val="left"/>
             </w:pPr>
             <w:r>
-              <w:t xml:space="preserve">Pin the databroker image digest and the Flutter SDK version; record both in the README</w:t>
+              <w:t xml:space="preserve">Pin the Flutter SDK version and record it in the README; the databroker image digest is already pinned</w:t>
             </w:r>
           </w:p>
         </w:tc>
@@ -1321,7 +1321,7 @@
               <w:jc w:val="left"/>
             </w:pPr>
             <w:r>
-              <w:t xml:space="preserve">Implemented</w:t>
+              <w:t xml:space="preserve">Partial</w:t>
             </w:r>
           </w:p>
         </w:tc>
@@ -1953,7 +1953,7 @@
         <w:pStyle w:val="FirstParagraph"/>
       </w:pPr>
       <w:r>
-        <w:t xml:space="preserve">Physical CAN hardware, the Raspberry Pi 5 baseline, per-client write authorisation (CS-4), security event logging (CS-7), the fail-visible renderer (SR-6) and the Autoware bridge (FR-22) stay in sprints 3 and 4 as planned in PULSE-StRS-001 section 3.1.</w:t>
+        <w:t xml:space="preserve">Six items stay in sprints 3 and 4, as the delivery plan in PULSE-StRS-001 section 3.1 already schedules them: physical CAN hardware, the Raspberry Pi 5 baseline, per-client write authorisation (CS-4), security event logging (CS-7), the fail-visible renderer (SR-6) and the Autoware bridge (FR-22).</w:t>
       </w:r>
     </w:p>
     <w:p>

</xml_diff>

<commit_message>
Publish workspace from pulse-cluster @ 7ea0443
Page built with --flat so pdf/ and the Markdown sources resolve from the
site root. Assets refreshed alongside it.
</commit_message>
<xml_diff>
--- a/pdf/PULSE-PLAN-002_Sprint_2_Backlog.docx
+++ b/pdf/PULSE-PLAN-002_Sprint_2_Backlog.docx
@@ -61,7 +61,7 @@
         <w:pStyle w:val="Date"/>
       </w:pPr>
       <w:r>
-        <w:t xml:space="preserve">2026-09-03</w:t>
+        <w:t xml:space="preserve">2026-09-08</w:t>
       </w:r>
     </w:p>
     <w:sdt>
@@ -216,7 +216,7 @@
               <w:jc w:val="left"/>
             </w:pPr>
             <w:r>
-              <w:t xml:space="preserve">0.1</w:t>
+              <w:t xml:space="preserve">0.2</w:t>
             </w:r>
           </w:p>
         </w:tc>
@@ -264,7 +264,7 @@
               <w:jc w:val="left"/>
             </w:pPr>
             <w:r>
-              <w:t xml:space="preserve">2026-09-03</w:t>
+              <w:t xml:space="preserve">2026-09-08</w:t>
             </w:r>
           </w:p>
         </w:tc>
@@ -527,6 +527,52 @@
             </w:pPr>
             <w:r>
               <w:t xml:space="preserve">First draft from the delivery plan and the week-3 status columns; review feedback section left open</w:t>
+            </w:r>
+          </w:p>
+        </w:tc>
+      </w:tr>
+      <w:tr>
+        <w:tc>
+          <w:p>
+            <w:pPr>
+              <w:pStyle w:val="Compact"/>
+              <w:jc w:val="left"/>
+            </w:pPr>
+            <w:r>
+              <w:t xml:space="preserve">0.2</w:t>
+            </w:r>
+          </w:p>
+        </w:tc>
+        <w:tc>
+          <w:p>
+            <w:pPr>
+              <w:pStyle w:val="Compact"/>
+              <w:jc w:val="left"/>
+            </w:pPr>
+            <w:r>
+              <w:t xml:space="preserve">2026-09-08</w:t>
+            </w:r>
+          </w:p>
+        </w:tc>
+        <w:tc>
+          <w:p>
+            <w:pPr>
+              <w:pStyle w:val="Compact"/>
+              <w:jc w:val="left"/>
+            </w:pPr>
+            <w:r>
+              <w:t xml:space="preserve">A. Abdelghany</w:t>
+            </w:r>
+          </w:p>
+        </w:tc>
+        <w:tc>
+          <w:p>
+            <w:pPr>
+              <w:pStyle w:val="Compact"/>
+              <w:jc w:val="left"/>
+            </w:pPr>
+            <w:r>
+              <w:t xml:space="preserve">Document-control fields corrected so the review gate and related documents resolve. Item 7 reduced to Partial: the databroker digest is pinned, the Flutter SDK version is not. Sprint goal and out-of-scope wording clarified</w:t>
             </w:r>
           </w:p>
         </w:tc>

</xml_diff>

<commit_message>
Publish workspace from pulse-cluster @ 7a63141
Page built with --flat so pdf/ and the Markdown sources resolve from the
site root. Assets refreshed alongside it.
</commit_message>
<xml_diff>
--- a/pdf/PULSE-PLAN-002_Sprint_2_Backlog.docx
+++ b/pdf/PULSE-PLAN-002_Sprint_2_Backlog.docx
@@ -61,7 +61,7 @@
         <w:pStyle w:val="Date"/>
       </w:pPr>
       <w:r>
-        <w:t xml:space="preserve">2026-09-08</w:t>
+        <w:t xml:space="preserve">2026-09-11</w:t>
       </w:r>
     </w:p>
     <w:sdt>
@@ -216,7 +216,7 @@
               <w:jc w:val="left"/>
             </w:pPr>
             <w:r>
-              <w:t xml:space="preserve">0.2</w:t>
+              <w:t xml:space="preserve">0.3</w:t>
             </w:r>
           </w:p>
         </w:tc>
@@ -264,7 +264,7 @@
               <w:jc w:val="left"/>
             </w:pPr>
             <w:r>
-              <w:t xml:space="preserve">2026-09-08</w:t>
+              <w:t xml:space="preserve">2026-09-11</w:t>
             </w:r>
           </w:p>
         </w:tc>
@@ -573,6 +573,52 @@
             </w:pPr>
             <w:r>
               <w:t xml:space="preserve">Document-control fields corrected so the review gate and related documents resolve. Item 7 reduced to Partial: the databroker digest is pinned, the Flutter SDK version is not. Sprint goal and out-of-scope wording clarified</w:t>
+            </w:r>
+          </w:p>
+        </w:tc>
+      </w:tr>
+      <w:tr>
+        <w:tc>
+          <w:p>
+            <w:pPr>
+              <w:pStyle w:val="Compact"/>
+              <w:jc w:val="left"/>
+            </w:pPr>
+            <w:r>
+              <w:t xml:space="preserve">0.3</w:t>
+            </w:r>
+          </w:p>
+        </w:tc>
+        <w:tc>
+          <w:p>
+            <w:pPr>
+              <w:pStyle w:val="Compact"/>
+              <w:jc w:val="left"/>
+            </w:pPr>
+            <w:r>
+              <w:t xml:space="preserve">2026-09-11</w:t>
+            </w:r>
+          </w:p>
+        </w:tc>
+        <w:tc>
+          <w:p>
+            <w:pPr>
+              <w:pStyle w:val="Compact"/>
+              <w:jc w:val="left"/>
+            </w:pPr>
+            <w:r>
+              <w:t xml:space="preserve">A. Abdelghany</w:t>
+            </w:r>
+          </w:p>
+        </w:tc>
+        <w:tc>
+          <w:p>
+            <w:pPr>
+              <w:pStyle w:val="Compact"/>
+              <w:jc w:val="left"/>
+            </w:pPr>
+            <w:r>
+              <w:t xml:space="preserve">Week 4 checkpoint added as section 8: per-item state verified against the repository, hours position, decisions requested. Sprint 1 review recorded as held with no comments</w:t>
             </w:r>
           </w:p>
         </w:tc>
@@ -2161,7 +2207,7 @@
         <w:pStyle w:val="FirstParagraph"/>
       </w:pPr>
       <w:r>
-        <w:t xml:space="preserve">To be filled in during the sprint 1 review. Each comment gets a line here and, where it changes a requirement, a change-log row in the owning document.</w:t>
+        <w:t xml:space="preserve">The review was held on 4 September as planned. No comments were raised and no requirement changed as a result, so this table is empty by outcome rather than by omission.</w:t>
       </w:r>
     </w:p>
     <w:tbl>
@@ -2263,19 +2309,59 @@
       </w:tr>
       <w:tr>
         <w:tc>
-          <w:p/>
-        </w:tc>
-        <w:tc>
-          <w:p/>
-        </w:tc>
-        <w:tc>
-          <w:p/>
-        </w:tc>
-        <w:tc>
-          <w:p/>
-        </w:tc>
-        <w:tc>
-          <w:p/>
+          <w:p>
+            <w:pPr>
+              <w:pStyle w:val="Compact"/>
+              <w:jc w:val="left"/>
+            </w:pPr>
+            <w:r>
+              <w:t xml:space="preserve">-</w:t>
+            </w:r>
+          </w:p>
+        </w:tc>
+        <w:tc>
+          <w:p>
+            <w:pPr>
+              <w:pStyle w:val="Compact"/>
+              <w:jc w:val="left"/>
+            </w:pPr>
+            <w:r>
+              <w:t xml:space="preserve">No comments raised at the review</w:t>
+            </w:r>
+          </w:p>
+        </w:tc>
+        <w:tc>
+          <w:p>
+            <w:pPr>
+              <w:pStyle w:val="Compact"/>
+              <w:jc w:val="left"/>
+            </w:pPr>
+            <w:r>
+              <w:t xml:space="preserve">-</w:t>
+            </w:r>
+          </w:p>
+        </w:tc>
+        <w:tc>
+          <w:p>
+            <w:pPr>
+              <w:pStyle w:val="Compact"/>
+              <w:jc w:val="left"/>
+            </w:pPr>
+            <w:r>
+              <w:t xml:space="preserve">None</w:t>
+            </w:r>
+          </w:p>
+        </w:tc>
+        <w:tc>
+          <w:p>
+            <w:pPr>
+              <w:pStyle w:val="Compact"/>
+              <w:jc w:val="left"/>
+            </w:pPr>
+            <w:r>
+              <w:t xml:space="preserve">-</w:t>
+            </w:r>
+          </w:p>
         </w:tc>
       </w:tr>
     </w:tbl>
@@ -2359,6 +2445,1904 @@
       </w:pPr>
       <w:r>
         <w:t xml:space="preserve">Demo rehearsed on the strip display and timed under five minutes.</w:t>
+      </w:r>
+    </w:p>
+    <w:p>
+      <w:pPr>
+        <w:pStyle w:val="Heading1"/>
+      </w:pPr>
+      <w:bookmarkStart w:id="29" w:name="progress-at-the-close-of-week-4"/>
+      <w:r>
+        <w:t xml:space="preserve">8. Progress at the close of week 4</w:t>
+      </w:r>
+      <w:bookmarkEnd w:id="29"/>
+    </w:p>
+    <w:p>
+      <w:pPr>
+        <w:pStyle w:val="FirstParagraph"/>
+      </w:pPr>
+      <w:r>
+        <w:t xml:space="preserve">Every state below was checked against the repository on 11 September, not</w:t>
+      </w:r>
+      <w:r>
+        <w:t xml:space="preserve"> </w:t>
+      </w:r>
+      <w:r>
+        <w:t xml:space="preserve">self-reported. Where an item is partly done, the gap is named.</w:t>
+      </w:r>
+    </w:p>
+    <w:tbl>
+      <w:tblPr>
+        <w:tblStyle w:val="Table"/>
+        <w:tblW w:type="pct" w:w="5000.0"/>
+        <w:tblLook w:firstRow="1"/>
+      </w:tblPr>
+      <w:tblGrid>
+        <w:gridCol w:w="298"/>
+        <w:gridCol w:w="1942"/>
+        <w:gridCol w:w="448"/>
+        <w:gridCol w:w="1046"/>
+        <w:gridCol w:w="1344"/>
+        <w:gridCol w:w="2839"/>
+      </w:tblGrid>
+      <w:tr>
+        <w:trPr>
+          <w:cnfStyle w:firstRow="1"/>
+        </w:trPr>
+        <w:tc>
+          <w:tcPr>
+            <w:tcBorders>
+              <w:bottom w:val="single"/>
+            </w:tcBorders>
+            <w:vAlign w:val="bottom"/>
+          </w:tcPr>
+          <w:p>
+            <w:pPr>
+              <w:pStyle w:val="Compact"/>
+              <w:jc w:val="left"/>
+            </w:pPr>
+            <w:r>
+              <w:t xml:space="preserve">#</w:t>
+            </w:r>
+          </w:p>
+        </w:tc>
+        <w:tc>
+          <w:tcPr>
+            <w:tcBorders>
+              <w:bottom w:val="single"/>
+            </w:tcBorders>
+            <w:vAlign w:val="bottom"/>
+          </w:tcPr>
+          <w:p>
+            <w:pPr>
+              <w:pStyle w:val="Compact"/>
+              <w:jc w:val="left"/>
+            </w:pPr>
+            <w:r>
+              <w:t xml:space="preserve">Item</w:t>
+            </w:r>
+          </w:p>
+        </w:tc>
+        <w:tc>
+          <w:tcPr>
+            <w:tcBorders>
+              <w:bottom w:val="single"/>
+            </w:tcBorders>
+            <w:vAlign w:val="bottom"/>
+          </w:tcPr>
+          <w:p>
+            <w:pPr>
+              <w:pStyle w:val="Compact"/>
+              <w:jc w:val="left"/>
+            </w:pPr>
+            <w:r>
+              <w:t xml:space="preserve">Est. h</w:t>
+            </w:r>
+          </w:p>
+        </w:tc>
+        <w:tc>
+          <w:tcPr>
+            <w:tcBorders>
+              <w:bottom w:val="single"/>
+            </w:tcBorders>
+            <w:vAlign w:val="bottom"/>
+          </w:tcPr>
+          <w:p>
+            <w:pPr>
+              <w:pStyle w:val="Compact"/>
+              <w:jc w:val="left"/>
+            </w:pPr>
+            <w:r>
+              <w:t xml:space="preserve">Target at the gate</w:t>
+            </w:r>
+          </w:p>
+        </w:tc>
+        <w:tc>
+          <w:tcPr>
+            <w:tcBorders>
+              <w:bottom w:val="single"/>
+            </w:tcBorders>
+            <w:vAlign w:val="bottom"/>
+          </w:tcPr>
+          <w:p>
+            <w:pPr>
+              <w:pStyle w:val="Compact"/>
+              <w:jc w:val="left"/>
+            </w:pPr>
+            <w:r>
+              <w:t xml:space="preserve">State at week 4</w:t>
+            </w:r>
+          </w:p>
+        </w:tc>
+        <w:tc>
+          <w:tcPr>
+            <w:tcBorders>
+              <w:bottom w:val="single"/>
+            </w:tcBorders>
+            <w:vAlign w:val="bottom"/>
+          </w:tcPr>
+          <w:p>
+            <w:pPr>
+              <w:pStyle w:val="Compact"/>
+              <w:jc w:val="left"/>
+            </w:pPr>
+            <w:r>
+              <w:t xml:space="preserve">Checked by</w:t>
+            </w:r>
+          </w:p>
+        </w:tc>
+      </w:tr>
+      <w:tr>
+        <w:tc>
+          <w:p>
+            <w:pPr>
+              <w:pStyle w:val="Compact"/>
+              <w:jc w:val="left"/>
+            </w:pPr>
+            <w:r>
+              <w:t xml:space="preserve">1</w:t>
+            </w:r>
+          </w:p>
+        </w:tc>
+        <w:tc>
+          <w:p>
+            <w:pPr>
+              <w:pStyle w:val="Compact"/>
+              <w:jc w:val="left"/>
+            </w:pPr>
+            <w:r>
+              <w:t xml:space="preserve">Regression suite</w:t>
+            </w:r>
+          </w:p>
+        </w:tc>
+        <w:tc>
+          <w:p>
+            <w:pPr>
+              <w:pStyle w:val="Compact"/>
+              <w:jc w:val="left"/>
+            </w:pPr>
+            <w:r>
+              <w:t xml:space="preserve">16</w:t>
+            </w:r>
+          </w:p>
+        </w:tc>
+        <w:tc>
+          <w:p>
+            <w:pPr>
+              <w:pStyle w:val="Compact"/>
+              <w:jc w:val="left"/>
+            </w:pPr>
+            <w:r>
+              <w:t xml:space="preserve">Implemented</w:t>
+            </w:r>
+          </w:p>
+        </w:tc>
+        <w:tc>
+          <w:p>
+            <w:pPr>
+              <w:pStyle w:val="Compact"/>
+              <w:jc w:val="left"/>
+            </w:pPr>
+            <w:r>
+              <w:t xml:space="preserve">Done, but runs by hand</w:t>
+            </w:r>
+          </w:p>
+        </w:tc>
+        <w:tc>
+          <w:p>
+            <w:pPr>
+              <w:pStyle w:val="Compact"/>
+              <w:jc w:val="left"/>
+            </w:pPr>
+            <w:r>
+              <w:t xml:space="preserve">Nine checks and six committed reports under</w:t>
+            </w:r>
+            <w:r>
+              <w:t xml:space="preserve"> </w:t>
+            </w:r>
+            <w:r>
+              <w:rPr>
+                <w:rStyle w:val="VerbatimChar"/>
+              </w:rPr>
+              <w:t xml:space="preserve">docs/evidence/</w:t>
+            </w:r>
+            <w:r>
+              <w:t xml:space="preserve">. No CI workflow exists, so nothing runs it automatically</w:t>
+            </w:r>
+          </w:p>
+        </w:tc>
+      </w:tr>
+      <w:tr>
+        <w:tc>
+          <w:p>
+            <w:pPr>
+              <w:pStyle w:val="Compact"/>
+              <w:jc w:val="left"/>
+            </w:pPr>
+            <w:r>
+              <w:t xml:space="preserve">2</w:t>
+            </w:r>
+          </w:p>
+        </w:tc>
+        <w:tc>
+          <w:p>
+            <w:pPr>
+              <w:pStyle w:val="Compact"/>
+              <w:jc w:val="left"/>
+            </w:pPr>
+            <w:r>
+              <w:t xml:space="preserve">Signal contract test</w:t>
+            </w:r>
+          </w:p>
+        </w:tc>
+        <w:tc>
+          <w:p>
+            <w:pPr>
+              <w:pStyle w:val="Compact"/>
+              <w:jc w:val="left"/>
+            </w:pPr>
+            <w:r>
+              <w:t xml:space="preserve">12</w:t>
+            </w:r>
+          </w:p>
+        </w:tc>
+        <w:tc>
+          <w:p>
+            <w:pPr>
+              <w:pStyle w:val="Compact"/>
+              <w:jc w:val="left"/>
+            </w:pPr>
+            <w:r>
+              <w:t xml:space="preserve">Implemented</w:t>
+            </w:r>
+          </w:p>
+        </w:tc>
+        <w:tc>
+          <w:p>
+            <w:pPr>
+              <w:pStyle w:val="Compact"/>
+              <w:jc w:val="left"/>
+            </w:pPr>
+            <w:r>
+              <w:t xml:space="preserve">Partly done</w:t>
+            </w:r>
+          </w:p>
+        </w:tc>
+        <w:tc>
+          <w:p>
+            <w:pPr>
+              <w:pStyle w:val="Compact"/>
+              <w:jc w:val="left"/>
+            </w:pPr>
+            <w:r>
+              <w:t xml:space="preserve">The check resolves 28 appendix A paths in the compiled tree. It does not subscribe and receive a typed datapoint, which is what the item asks for</w:t>
+            </w:r>
+          </w:p>
+        </w:tc>
+      </w:tr>
+      <w:tr>
+        <w:tc>
+          <w:p>
+            <w:pPr>
+              <w:pStyle w:val="Compact"/>
+              <w:jc w:val="left"/>
+            </w:pPr>
+            <w:r>
+              <w:t xml:space="preserve">3</w:t>
+            </w:r>
+          </w:p>
+        </w:tc>
+        <w:tc>
+          <w:p>
+            <w:pPr>
+              <w:pStyle w:val="Compact"/>
+              <w:jc w:val="left"/>
+            </w:pPr>
+            <w:r>
+              <w:t xml:space="preserve">UI smoke test per build</w:t>
+            </w:r>
+          </w:p>
+        </w:tc>
+        <w:tc>
+          <w:p>
+            <w:pPr>
+              <w:pStyle w:val="Compact"/>
+              <w:jc w:val="left"/>
+            </w:pPr>
+            <w:r>
+              <w:t xml:space="preserve">20</w:t>
+            </w:r>
+          </w:p>
+        </w:tc>
+        <w:tc>
+          <w:p>
+            <w:pPr>
+              <w:pStyle w:val="Compact"/>
+              <w:jc w:val="left"/>
+            </w:pPr>
+            <w:r>
+              <w:t xml:space="preserve">Implemented</w:t>
+            </w:r>
+          </w:p>
+        </w:tc>
+        <w:tc>
+          <w:p>
+            <w:pPr>
+              <w:pStyle w:val="Compact"/>
+              <w:jc w:val="left"/>
+            </w:pPr>
+            <w:r>
+              <w:t xml:space="preserve">Barely started</w:t>
+            </w:r>
+          </w:p>
+        </w:tc>
+        <w:tc>
+          <w:p>
+            <w:pPr>
+              <w:pStyle w:val="Compact"/>
+              <w:jc w:val="left"/>
+            </w:pPr>
+            <w:r>
+              <w:rPr>
+                <w:rStyle w:val="VerbatimChar"/>
+              </w:rPr>
+              <w:t xml:space="preserve">flutter-launch</w:t>
+            </w:r>
+            <w:r>
+              <w:t xml:space="preserve"> </w:t>
+            </w:r>
+            <w:r>
+              <w:t xml:space="preserve">asserts the process stays up for four seconds. No injected value, no assertion on what is rendered, nothing on Compose</w:t>
+            </w:r>
+          </w:p>
+        </w:tc>
+      </w:tr>
+      <w:tr>
+        <w:tc>
+          <w:p>
+            <w:pPr>
+              <w:pStyle w:val="Compact"/>
+              <w:jc w:val="left"/>
+            </w:pPr>
+            <w:r>
+              <w:t xml:space="preserve">4</w:t>
+            </w:r>
+          </w:p>
+        </w:tc>
+        <w:tc>
+          <w:p>
+            <w:pPr>
+              <w:pStyle w:val="Compact"/>
+              <w:jc w:val="left"/>
+            </w:pPr>
+            <w:r>
+              <w:t xml:space="preserve">Flutter staleness display</w:t>
+            </w:r>
+          </w:p>
+        </w:tc>
+        <w:tc>
+          <w:p>
+            <w:pPr>
+              <w:pStyle w:val="Compact"/>
+              <w:jc w:val="left"/>
+            </w:pPr>
+            <w:r>
+              <w:t xml:space="preserve">32</w:t>
+            </w:r>
+          </w:p>
+        </w:tc>
+        <w:tc>
+          <w:p>
+            <w:pPr>
+              <w:pStyle w:val="Compact"/>
+              <w:jc w:val="left"/>
+            </w:pPr>
+            <w:r>
+              <w:t xml:space="preserve">Implemented</w:t>
+            </w:r>
+          </w:p>
+        </w:tc>
+        <w:tc>
+          <w:p>
+            <w:pPr>
+              <w:pStyle w:val="Compact"/>
+              <w:jc w:val="left"/>
+            </w:pPr>
+            <w:r>
+              <w:t xml:space="preserve">Not started</w:t>
+            </w:r>
+          </w:p>
+        </w:tc>
+        <w:tc>
+          <w:p>
+            <w:pPr>
+              <w:pStyle w:val="Compact"/>
+              <w:jc w:val="left"/>
+            </w:pPr>
+            <w:r>
+              <w:t xml:space="preserve">No freshness or staleness logic in hand-written HMI source</w:t>
+            </w:r>
+          </w:p>
+        </w:tc>
+      </w:tr>
+      <w:tr>
+        <w:tc>
+          <w:p>
+            <w:pPr>
+              <w:pStyle w:val="Compact"/>
+              <w:jc w:val="left"/>
+            </w:pPr>
+            <w:r>
+              <w:t xml:space="preserve">5</w:t>
+            </w:r>
+          </w:p>
+        </w:tc>
+        <w:tc>
+          <w:p>
+            <w:pPr>
+              <w:pStyle w:val="Compact"/>
+              <w:jc w:val="left"/>
+            </w:pPr>
+            <w:r>
+              <w:t xml:space="preserve">Compose staleness display</w:t>
+            </w:r>
+          </w:p>
+        </w:tc>
+        <w:tc>
+          <w:p>
+            <w:pPr>
+              <w:pStyle w:val="Compact"/>
+              <w:jc w:val="left"/>
+            </w:pPr>
+            <w:r>
+              <w:t xml:space="preserve">16</w:t>
+            </w:r>
+          </w:p>
+        </w:tc>
+        <w:tc>
+          <w:p>
+            <w:pPr>
+              <w:pStyle w:val="Compact"/>
+              <w:jc w:val="left"/>
+            </w:pPr>
+            <w:r>
+              <w:t xml:space="preserve">Implemented</w:t>
+            </w:r>
+          </w:p>
+        </w:tc>
+        <w:tc>
+          <w:p>
+            <w:pPr>
+              <w:pStyle w:val="Compact"/>
+              <w:jc w:val="left"/>
+            </w:pPr>
+            <w:r>
+              <w:t xml:space="preserve">Not started</w:t>
+            </w:r>
+          </w:p>
+        </w:tc>
+        <w:tc>
+          <w:p>
+            <w:pPr>
+              <w:pStyle w:val="Compact"/>
+              <w:jc w:val="left"/>
+            </w:pPr>
+            <w:r>
+              <w:t xml:space="preserve">As above</w:t>
+            </w:r>
+          </w:p>
+        </w:tc>
+      </w:tr>
+      <w:tr>
+        <w:tc>
+          <w:p>
+            <w:pPr>
+              <w:pStyle w:val="Compact"/>
+              <w:jc w:val="left"/>
+            </w:pPr>
+            <w:r>
+              <w:t xml:space="preserve">6</w:t>
+            </w:r>
+          </w:p>
+        </w:tc>
+        <w:tc>
+          <w:p>
+            <w:pPr>
+              <w:pStyle w:val="Compact"/>
+              <w:jc w:val="left"/>
+            </w:pPr>
+            <w:r>
+              <w:t xml:space="preserve">Mutual TLS on the broker</w:t>
+            </w:r>
+          </w:p>
+        </w:tc>
+        <w:tc>
+          <w:p>
+            <w:pPr>
+              <w:pStyle w:val="Compact"/>
+              <w:jc w:val="left"/>
+            </w:pPr>
+            <w:r>
+              <w:t xml:space="preserve">24</w:t>
+            </w:r>
+          </w:p>
+        </w:tc>
+        <w:tc>
+          <w:p>
+            <w:pPr>
+              <w:pStyle w:val="Compact"/>
+              <w:jc w:val="left"/>
+            </w:pPr>
+            <w:r>
+              <w:t xml:space="preserve">Implemented</w:t>
+            </w:r>
+          </w:p>
+        </w:tc>
+        <w:tc>
+          <w:p>
+            <w:pPr>
+              <w:pStyle w:val="Compact"/>
+              <w:jc w:val="left"/>
+            </w:pPr>
+            <w:r>
+              <w:t xml:space="preserve">Not started</w:t>
+            </w:r>
+          </w:p>
+        </w:tc>
+        <w:tc>
+          <w:p>
+            <w:pPr>
+              <w:pStyle w:val="Compact"/>
+              <w:jc w:val="left"/>
+            </w:pPr>
+            <w:r>
+              <w:rPr>
+                <w:rStyle w:val="VerbatimChar"/>
+              </w:rPr>
+              <w:t xml:space="preserve">scripts/start-databroker.sh</w:t>
+            </w:r>
+            <w:r>
+              <w:t xml:space="preserve"> </w:t>
+            </w:r>
+            <w:r>
+              <w:t xml:space="preserve">still passes</w:t>
+            </w:r>
+            <w:r>
+              <w:t xml:space="preserve"> </w:t>
+            </w:r>
+            <w:r>
+              <w:rPr>
+                <w:rStyle w:val="VerbatimChar"/>
+              </w:rPr>
+              <w:t xml:space="preserve">--insecure</w:t>
+            </w:r>
+          </w:p>
+        </w:tc>
+      </w:tr>
+      <w:tr>
+        <w:tc>
+          <w:p>
+            <w:pPr>
+              <w:pStyle w:val="Compact"/>
+              <w:jc w:val="left"/>
+            </w:pPr>
+            <w:r>
+              <w:t xml:space="preserve">7</w:t>
+            </w:r>
+          </w:p>
+        </w:tc>
+        <w:tc>
+          <w:p>
+            <w:pPr>
+              <w:pStyle w:val="Compact"/>
+              <w:jc w:val="left"/>
+            </w:pPr>
+            <w:r>
+              <w:t xml:space="preserve">Pin the Flutter SDK</w:t>
+            </w:r>
+          </w:p>
+        </w:tc>
+        <w:tc>
+          <w:p>
+            <w:pPr>
+              <w:pStyle w:val="Compact"/>
+              <w:jc w:val="left"/>
+            </w:pPr>
+            <w:r>
+              <w:t xml:space="preserve">6</w:t>
+            </w:r>
+          </w:p>
+        </w:tc>
+        <w:tc>
+          <w:p>
+            <w:pPr>
+              <w:pStyle w:val="Compact"/>
+              <w:jc w:val="left"/>
+            </w:pPr>
+            <w:r>
+              <w:t xml:space="preserve">Partial</w:t>
+            </w:r>
+          </w:p>
+        </w:tc>
+        <w:tc>
+          <w:p>
+            <w:pPr>
+              <w:pStyle w:val="Compact"/>
+              <w:jc w:val="left"/>
+            </w:pPr>
+            <w:r>
+              <w:t xml:space="preserve">Half done</w:t>
+            </w:r>
+          </w:p>
+        </w:tc>
+        <w:tc>
+          <w:p>
+            <w:pPr>
+              <w:pStyle w:val="Compact"/>
+              <w:jc w:val="left"/>
+            </w:pPr>
+            <w:r>
+              <w:t xml:space="preserve">Broker pinned by tag and digest. No FVM pin and no SDK version recorded in the README</w:t>
+            </w:r>
+          </w:p>
+        </w:tc>
+      </w:tr>
+      <w:tr>
+        <w:tc>
+          <w:p>
+            <w:pPr>
+              <w:pStyle w:val="Compact"/>
+              <w:jc w:val="left"/>
+            </w:pPr>
+            <w:r>
+              <w:t xml:space="preserve">8</w:t>
+            </w:r>
+          </w:p>
+        </w:tc>
+        <w:tc>
+          <w:p>
+            <w:pPr>
+              <w:pStyle w:val="Compact"/>
+              <w:jc w:val="left"/>
+            </w:pPr>
+            <w:r>
+              <w:t xml:space="preserve">SBOM and vulnerability check</w:t>
+            </w:r>
+          </w:p>
+        </w:tc>
+        <w:tc>
+          <w:p>
+            <w:pPr>
+              <w:pStyle w:val="Compact"/>
+              <w:jc w:val="left"/>
+            </w:pPr>
+            <w:r>
+              <w:t xml:space="preserve">14</w:t>
+            </w:r>
+          </w:p>
+        </w:tc>
+        <w:tc>
+          <w:p>
+            <w:pPr>
+              <w:pStyle w:val="Compact"/>
+              <w:jc w:val="left"/>
+            </w:pPr>
+            <w:r>
+              <w:t xml:space="preserve">Implemented</w:t>
+            </w:r>
+          </w:p>
+        </w:tc>
+        <w:tc>
+          <w:p>
+            <w:pPr>
+              <w:pStyle w:val="Compact"/>
+              <w:jc w:val="left"/>
+            </w:pPr>
+            <w:r>
+              <w:t xml:space="preserve">Not started</w:t>
+            </w:r>
+          </w:p>
+        </w:tc>
+        <w:tc>
+          <w:p>
+            <w:pPr>
+              <w:pStyle w:val="Compact"/>
+              <w:jc w:val="left"/>
+            </w:pPr>
+            <w:r>
+              <w:t xml:space="preserve">No SBOM file and no check</w:t>
+            </w:r>
+          </w:p>
+        </w:tc>
+      </w:tr>
+      <w:tr>
+        <w:tc>
+          <w:p>
+            <w:pPr>
+              <w:pStyle w:val="Compact"/>
+              <w:jc w:val="left"/>
+            </w:pPr>
+            <w:r>
+              <w:t xml:space="preserve">9</w:t>
+            </w:r>
+          </w:p>
+        </w:tc>
+        <w:tc>
+          <w:p>
+            <w:pPr>
+              <w:pStyle w:val="Compact"/>
+              <w:jc w:val="left"/>
+            </w:pPr>
+            <w:r>
+              <w:t xml:space="preserve">Driver-monitor privacy test</w:t>
+            </w:r>
+          </w:p>
+        </w:tc>
+        <w:tc>
+          <w:p>
+            <w:pPr>
+              <w:pStyle w:val="Compact"/>
+              <w:jc w:val="left"/>
+            </w:pPr>
+            <w:r>
+              <w:t xml:space="preserve">6</w:t>
+            </w:r>
+          </w:p>
+        </w:tc>
+        <w:tc>
+          <w:p>
+            <w:pPr>
+              <w:pStyle w:val="Compact"/>
+              <w:jc w:val="left"/>
+            </w:pPr>
+            <w:r>
+              <w:t xml:space="preserve">Implemented</w:t>
+            </w:r>
+          </w:p>
+        </w:tc>
+        <w:tc>
+          <w:p>
+            <w:pPr>
+              <w:pStyle w:val="Compact"/>
+              <w:jc w:val="left"/>
+            </w:pPr>
+            <w:r>
+              <w:t xml:space="preserve">Not started</w:t>
+            </w:r>
+          </w:p>
+        </w:tc>
+        <w:tc>
+          <w:p>
+            <w:pPr>
+              <w:pStyle w:val="Compact"/>
+              <w:jc w:val="left"/>
+            </w:pPr>
+            <w:r>
+              <w:t xml:space="preserve">No check. The claim holds by inspection but nothing proves it</w:t>
+            </w:r>
+          </w:p>
+        </w:tc>
+      </w:tr>
+      <w:tr>
+        <w:tc>
+          <w:p>
+            <w:pPr>
+              <w:pStyle w:val="Compact"/>
+              <w:jc w:val="left"/>
+            </w:pPr>
+            <w:r>
+              <w:t xml:space="preserve">10</w:t>
+            </w:r>
+          </w:p>
+        </w:tc>
+        <w:tc>
+          <w:p>
+            <w:pPr>
+              <w:pStyle w:val="Compact"/>
+              <w:jc w:val="left"/>
+            </w:pPr>
+            <w:r>
+              <w:t xml:space="preserve">HMI-side range check</w:t>
+            </w:r>
+          </w:p>
+        </w:tc>
+        <w:tc>
+          <w:p>
+            <w:pPr>
+              <w:pStyle w:val="Compact"/>
+              <w:jc w:val="left"/>
+            </w:pPr>
+            <w:r>
+              <w:t xml:space="preserve">10</w:t>
+            </w:r>
+          </w:p>
+        </w:tc>
+        <w:tc>
+          <w:p>
+            <w:pPr>
+              <w:pStyle w:val="Compact"/>
+              <w:jc w:val="left"/>
+            </w:pPr>
+            <w:r>
+              <w:t xml:space="preserve">Implemented</w:t>
+            </w:r>
+          </w:p>
+        </w:tc>
+        <w:tc>
+          <w:p>
+            <w:pPr>
+              <w:pStyle w:val="Compact"/>
+              <w:jc w:val="left"/>
+            </w:pPr>
+            <w:r>
+              <w:t xml:space="preserve">Not started</w:t>
+            </w:r>
+          </w:p>
+        </w:tc>
+        <w:tc>
+          <w:p>
+            <w:pPr>
+              <w:pStyle w:val="Compact"/>
+              <w:jc w:val="left"/>
+            </w:pPr>
+            <w:r>
+              <w:t xml:space="preserve">Broker-side validation only</w:t>
+            </w:r>
+          </w:p>
+        </w:tc>
+      </w:tr>
+      <w:tr>
+        <w:tc>
+          <w:p>
+            <w:pPr>
+              <w:pStyle w:val="Compact"/>
+              <w:jc w:val="left"/>
+            </w:pPr>
+            <w:r>
+              <w:t xml:space="preserve">11</w:t>
+            </w:r>
+          </w:p>
+        </w:tc>
+        <w:tc>
+          <w:p>
+            <w:pPr>
+              <w:pStyle w:val="Compact"/>
+              <w:jc w:val="left"/>
+            </w:pPr>
+            <w:r>
+              <w:t xml:space="preserve">Catalogue checksum</w:t>
+            </w:r>
+          </w:p>
+        </w:tc>
+        <w:tc>
+          <w:p>
+            <w:pPr>
+              <w:pStyle w:val="Compact"/>
+              <w:jc w:val="left"/>
+            </w:pPr>
+            <w:r>
+              <w:t xml:space="preserve">4</w:t>
+            </w:r>
+          </w:p>
+        </w:tc>
+        <w:tc>
+          <w:p>
+            <w:pPr>
+              <w:pStyle w:val="Compact"/>
+              <w:jc w:val="left"/>
+            </w:pPr>
+            <w:r>
+              <w:t xml:space="preserve">Implemented</w:t>
+            </w:r>
+          </w:p>
+        </w:tc>
+        <w:tc>
+          <w:p>
+            <w:pPr>
+              <w:pStyle w:val="Compact"/>
+              <w:jc w:val="left"/>
+            </w:pPr>
+            <w:r>
+              <w:t xml:space="preserve">Not started</w:t>
+            </w:r>
+          </w:p>
+        </w:tc>
+        <w:tc>
+          <w:p>
+            <w:pPr>
+              <w:pStyle w:val="Compact"/>
+              <w:jc w:val="left"/>
+            </w:pPr>
+            <w:r>
+              <w:t xml:space="preserve">No check</w:t>
+            </w:r>
+          </w:p>
+        </w:tc>
+      </w:tr>
+      <w:tr>
+        <w:tc>
+          <w:p>
+            <w:pPr>
+              <w:pStyle w:val="Compact"/>
+              <w:jc w:val="left"/>
+            </w:pPr>
+            <w:r>
+              <w:t xml:space="preserve">12</w:t>
+            </w:r>
+          </w:p>
+        </w:tc>
+        <w:tc>
+          <w:p>
+            <w:pPr>
+              <w:pStyle w:val="Compact"/>
+              <w:jc w:val="left"/>
+            </w:pPr>
+            <w:r>
+              <w:t xml:space="preserve">Merge the monitoring branch</w:t>
+            </w:r>
+          </w:p>
+        </w:tc>
+        <w:tc>
+          <w:p>
+            <w:pPr>
+              <w:pStyle w:val="Compact"/>
+              <w:jc w:val="left"/>
+            </w:pPr>
+            <w:r>
+              <w:t xml:space="preserve">4</w:t>
+            </w:r>
+          </w:p>
+        </w:tc>
+        <w:tc>
+          <w:p>
+            <w:pPr>
+              <w:pStyle w:val="Compact"/>
+              <w:jc w:val="left"/>
+            </w:pPr>
+            <w:r>
+              <w:t xml:space="preserve">Done</w:t>
+            </w:r>
+          </w:p>
+        </w:tc>
+        <w:tc>
+          <w:p>
+            <w:pPr>
+              <w:pStyle w:val="Compact"/>
+              <w:jc w:val="left"/>
+            </w:pPr>
+            <w:r>
+              <w:t xml:space="preserve">Done</w:t>
+            </w:r>
+          </w:p>
+        </w:tc>
+        <w:tc>
+          <w:p>
+            <w:pPr>
+              <w:pStyle w:val="Compact"/>
+              <w:jc w:val="left"/>
+            </w:pPr>
+            <w:r>
+              <w:t xml:space="preserve">Merged into</w:t>
+            </w:r>
+            <w:r>
+              <w:t xml:space="preserve"> </w:t>
+            </w:r>
+            <w:r>
+              <w:rPr>
+                <w:rStyle w:val="VerbatimChar"/>
+              </w:rPr>
+              <w:t xml:space="preserve">main</w:t>
+            </w:r>
+            <w:r>
+              <w:t xml:space="preserve"> </w:t>
+            </w:r>
+            <w:r>
+              <w:t xml:space="preserve">on 4 September</w:t>
+            </w:r>
+          </w:p>
+        </w:tc>
+      </w:tr>
+      <w:tr>
+        <w:tc>
+          <w:p>
+            <w:pPr>
+              <w:pStyle w:val="Compact"/>
+              <w:jc w:val="left"/>
+            </w:pPr>
+            <w:r>
+              <w:t xml:space="preserve">13</w:t>
+            </w:r>
+          </w:p>
+        </w:tc>
+        <w:tc>
+          <w:p>
+            <w:pPr>
+              <w:pStyle w:val="Compact"/>
+              <w:jc w:val="left"/>
+            </w:pPr>
+            <w:r>
+              <w:t xml:space="preserve">Architecture write-ups</w:t>
+            </w:r>
+          </w:p>
+        </w:tc>
+        <w:tc>
+          <w:p>
+            <w:pPr>
+              <w:pStyle w:val="Compact"/>
+              <w:jc w:val="left"/>
+            </w:pPr>
+            <w:r>
+              <w:t xml:space="preserve">16</w:t>
+            </w:r>
+          </w:p>
+        </w:tc>
+        <w:tc>
+          <w:p>
+            <w:pPr>
+              <w:pStyle w:val="Compact"/>
+              <w:jc w:val="left"/>
+            </w:pPr>
+            <w:r>
+              <w:t xml:space="preserve">Implemented</w:t>
+            </w:r>
+          </w:p>
+        </w:tc>
+        <w:tc>
+          <w:p>
+            <w:pPr>
+              <w:pStyle w:val="Compact"/>
+              <w:jc w:val="left"/>
+            </w:pPr>
+            <w:r>
+              <w:t xml:space="preserve">Not started</w:t>
+            </w:r>
+          </w:p>
+        </w:tc>
+        <w:tc>
+          <w:p>
+            <w:pPr>
+              <w:pStyle w:val="Compact"/>
+              <w:jc w:val="left"/>
+            </w:pPr>
+            <w:r>
+              <w:t xml:space="preserve">No SWAD documents exist</w:t>
+            </w:r>
+          </w:p>
+        </w:tc>
+      </w:tr>
+      <w:tr>
+        <w:tc>
+          <w:p>
+            <w:pPr>
+              <w:pStyle w:val="Compact"/>
+              <w:jc w:val="left"/>
+            </w:pPr>
+            <w:r>
+              <w:t xml:space="preserve">14</w:t>
+            </w:r>
+          </w:p>
+        </w:tc>
+        <w:tc>
+          <w:p>
+            <w:pPr>
+              <w:pStyle w:val="Compact"/>
+              <w:jc w:val="left"/>
+            </w:pPr>
+            <w:r>
+              <w:t xml:space="preserve">Safety and security review</w:t>
+            </w:r>
+          </w:p>
+        </w:tc>
+        <w:tc>
+          <w:p>
+            <w:pPr>
+              <w:pStyle w:val="Compact"/>
+              <w:jc w:val="left"/>
+            </w:pPr>
+            <w:r>
+              <w:t xml:space="preserve">8</w:t>
+            </w:r>
+          </w:p>
+        </w:tc>
+        <w:tc>
+          <w:p>
+            <w:pPr>
+              <w:pStyle w:val="Compact"/>
+              <w:jc w:val="left"/>
+            </w:pPr>
+            <w:r>
+              <w:t xml:space="preserve">Reviewed</w:t>
+            </w:r>
+          </w:p>
+        </w:tc>
+        <w:tc>
+          <w:p>
+            <w:pPr>
+              <w:pStyle w:val="Compact"/>
+              <w:jc w:val="left"/>
+            </w:pPr>
+            <w:r>
+              <w:t xml:space="preserve">Not held</w:t>
+            </w:r>
+          </w:p>
+        </w:tc>
+        <w:tc>
+          <w:p>
+            <w:pPr>
+              <w:pStyle w:val="Compact"/>
+              <w:jc w:val="left"/>
+            </w:pPr>
+            <w:r>
+              <w:t xml:space="preserve">Both concepts still carry</w:t>
+            </w:r>
+            <w:r>
+              <w:t xml:space="preserve"> </w:t>
+            </w:r>
+            <w:r>
+              <w:t xml:space="preserve">“</w:t>
+            </w:r>
+            <w:r>
+              <w:t xml:space="preserve">not safety-reviewed</w:t>
+            </w:r>
+            <w:r>
+              <w:t xml:space="preserve">”</w:t>
+            </w:r>
+            <w:r>
+              <w:t xml:space="preserve"> </w:t>
+            </w:r>
+            <w:r>
+              <w:t xml:space="preserve">and</w:t>
+            </w:r>
+            <w:r>
+              <w:t xml:space="preserve"> </w:t>
+            </w:r>
+            <w:r>
+              <w:t xml:space="preserve">“</w:t>
+            </w:r>
+            <w:r>
+              <w:t xml:space="preserve">not security-reviewed</w:t>
+            </w:r>
+            <w:r>
+              <w:t xml:space="preserve">”</w:t>
+            </w:r>
+          </w:p>
+        </w:tc>
+      </w:tr>
+      <w:tr>
+        <w:tc>
+          <w:p>
+            <w:pPr>
+              <w:pStyle w:val="Compact"/>
+              <w:jc w:val="left"/>
+            </w:pPr>
+            <w:r>
+              <w:t xml:space="preserve">15</w:t>
+            </w:r>
+          </w:p>
+        </w:tc>
+        <w:tc>
+          <w:p>
+            <w:pPr>
+              <w:pStyle w:val="Compact"/>
+              <w:jc w:val="left"/>
+            </w:pPr>
+            <w:r>
+              <w:t xml:space="preserve">Virtual CAN feeder spike</w:t>
+            </w:r>
+          </w:p>
+        </w:tc>
+        <w:tc>
+          <w:p>
+            <w:pPr>
+              <w:pStyle w:val="Compact"/>
+              <w:jc w:val="left"/>
+            </w:pPr>
+            <w:r>
+              <w:t xml:space="preserve">8</w:t>
+            </w:r>
+          </w:p>
+        </w:tc>
+        <w:tc>
+          <w:p>
+            <w:pPr>
+              <w:pStyle w:val="Compact"/>
+              <w:jc w:val="left"/>
+            </w:pPr>
+            <w:r>
+              <w:t xml:space="preserve">Partial</w:t>
+            </w:r>
+          </w:p>
+        </w:tc>
+        <w:tc>
+          <w:p>
+            <w:pPr>
+              <w:pStyle w:val="Compact"/>
+              <w:jc w:val="left"/>
+            </w:pPr>
+            <w:r>
+              <w:t xml:space="preserve">Not started</w:t>
+            </w:r>
+          </w:p>
+        </w:tc>
+        <w:tc>
+          <w:p>
+            <w:pPr>
+              <w:pStyle w:val="Compact"/>
+              <w:jc w:val="left"/>
+            </w:pPr>
+            <w:r>
+              <w:t xml:space="preserve">No</w:t>
+            </w:r>
+            <w:r>
+              <w:t xml:space="preserve"> </w:t>
+            </w:r>
+            <w:r>
+              <w:rPr>
+                <w:rStyle w:val="VerbatimChar"/>
+              </w:rPr>
+              <w:t xml:space="preserve">vcan0</w:t>
+            </w:r>
+            <w:r>
+              <w:t xml:space="preserve"> </w:t>
+            </w:r>
+            <w:r>
+              <w:t xml:space="preserve">or provider work. The only matches in the tree are diagram labels</w:t>
+            </w:r>
+          </w:p>
+        </w:tc>
+      </w:tr>
+    </w:tbl>
+    <w:p>
+      <w:pPr>
+        <w:pStyle w:val="Heading2"/>
+      </w:pPr>
+      <w:bookmarkStart w:id="30" w:name="hours"/>
+      <w:r>
+        <w:t xml:space="preserve">8.1 Hours</w:t>
+      </w:r>
+      <w:bookmarkEnd w:id="30"/>
+    </w:p>
+    <w:tbl>
+      <w:tblPr>
+        <w:tblStyle w:val="Table"/>
+        <w:tblW w:type="pct" w:w="0.0"/>
+        <w:tblLook w:firstRow="1"/>
+      </w:tblPr>
+      <w:tblGrid/>
+      <w:tr>
+        <w:trPr>
+          <w:cnfStyle w:firstRow="1"/>
+        </w:trPr>
+        <w:tc>
+          <w:tcPr>
+            <w:tcBorders>
+              <w:bottom w:val="single"/>
+            </w:tcBorders>
+            <w:vAlign w:val="bottom"/>
+          </w:tcPr>
+          <w:p>
+            <w:pPr>
+              <w:pStyle w:val="Compact"/>
+              <w:jc w:val="left"/>
+            </w:pPr>
+            <w:r>
+              <w:t xml:space="preserve">Position</w:t>
+            </w:r>
+          </w:p>
+        </w:tc>
+        <w:tc>
+          <w:tcPr>
+            <w:tcBorders>
+              <w:bottom w:val="single"/>
+            </w:tcBorders>
+            <w:vAlign w:val="bottom"/>
+          </w:tcPr>
+          <w:p>
+            <w:pPr>
+              <w:pStyle w:val="Compact"/>
+              <w:jc w:val="left"/>
+            </w:pPr>
+            <w:r>
+              <w:t xml:space="preserve">Hours</w:t>
+            </w:r>
+          </w:p>
+        </w:tc>
+      </w:tr>
+      <w:tr>
+        <w:tc>
+          <w:p>
+            <w:pPr>
+              <w:pStyle w:val="Compact"/>
+              <w:jc w:val="left"/>
+            </w:pPr>
+            <w:r>
+              <w:t xml:space="preserve">Committed in section 3</w:t>
+            </w:r>
+          </w:p>
+        </w:tc>
+        <w:tc>
+          <w:p>
+            <w:pPr>
+              <w:pStyle w:val="Compact"/>
+              <w:jc w:val="left"/>
+            </w:pPr>
+            <w:r>
+              <w:t xml:space="preserve">196</w:t>
+            </w:r>
+          </w:p>
+        </w:tc>
+      </w:tr>
+      <w:tr>
+        <w:tc>
+          <w:p>
+            <w:pPr>
+              <w:pStyle w:val="Compact"/>
+              <w:jc w:val="left"/>
+            </w:pPr>
+            <w:r>
+              <w:t xml:space="preserve">Delivered by the close of week 4</w:t>
+            </w:r>
+          </w:p>
+        </w:tc>
+        <w:tc>
+          <w:p>
+            <w:pPr>
+              <w:pStyle w:val="Compact"/>
+              <w:jc w:val="left"/>
+            </w:pPr>
+            <w:r>
+              <w:t xml:space="preserve">about 33</w:t>
+            </w:r>
+          </w:p>
+        </w:tc>
+      </w:tr>
+      <w:tr>
+        <w:tc>
+          <w:p>
+            <w:pPr>
+              <w:pStyle w:val="Compact"/>
+              <w:jc w:val="left"/>
+            </w:pPr>
+            <w:r>
+              <w:t xml:space="preserve">Remaining</w:t>
+            </w:r>
+          </w:p>
+        </w:tc>
+        <w:tc>
+          <w:p>
+            <w:pPr>
+              <w:pStyle w:val="Compact"/>
+              <w:jc w:val="left"/>
+            </w:pPr>
+            <w:r>
+              <w:t xml:space="preserve">about 163</w:t>
+            </w:r>
+          </w:p>
+        </w:tc>
+      </w:tr>
+      <w:tr>
+        <w:tc>
+          <w:p>
+            <w:pPr>
+              <w:pStyle w:val="Compact"/>
+              <w:jc w:val="left"/>
+            </w:pPr>
+            <w:r>
+              <w:t xml:space="preserve">Capacity left, weeks 5 and 6</w:t>
+            </w:r>
+          </w:p>
+        </w:tc>
+        <w:tc>
+          <w:p>
+            <w:pPr>
+              <w:pStyle w:val="Compact"/>
+              <w:jc w:val="left"/>
+            </w:pPr>
+            <w:r>
+              <w:t xml:space="preserve">160</w:t>
+            </w:r>
+          </w:p>
+        </w:tc>
+      </w:tr>
+    </w:tbl>
+    <w:p>
+      <w:pPr>
+        <w:pStyle w:val="BodyText"/>
+      </w:pPr>
+      <w:r>
+        <w:t xml:space="preserve">The sprint reserve of 44 hours was held for review feedback and risk. The review</w:t>
+      </w:r>
+      <w:r>
+        <w:t xml:space="preserve"> </w:t>
+      </w:r>
+      <w:r>
+        <w:t xml:space="preserve">raised no feedback, so that reserve was available. Week 4 spent it on work that</w:t>
+      </w:r>
+      <w:r>
+        <w:t xml:space="preserve"> </w:t>
+      </w:r>
+      <w:r>
+        <w:t xml:space="preserve">was not in this backlog, so the position is now roughly break-even with no</w:t>
+      </w:r>
+      <w:r>
+        <w:t xml:space="preserve"> </w:t>
+      </w:r>
+      <w:r>
+        <w:t xml:space="preserve">slack at all. One illness, one hard defect, or one more week like the last, and</w:t>
+      </w:r>
+      <w:r>
+        <w:t xml:space="preserve"> </w:t>
+      </w:r>
+      <w:r>
+        <w:t xml:space="preserve">the gate is missed.</w:t>
+      </w:r>
+    </w:p>
+    <w:p>
+      <w:pPr>
+        <w:pStyle w:val="Heading2"/>
+      </w:pPr>
+      <w:bookmarkStart w:id="31" w:name="what-week-4-actually-produced"/>
+      <w:r>
+        <w:t xml:space="preserve">8.2 What week 4 actually produced</w:t>
+      </w:r>
+      <w:bookmarkEnd w:id="31"/>
+    </w:p>
+    <w:p>
+      <w:pPr>
+        <w:pStyle w:val="FirstParagraph"/>
+      </w:pPr>
+      <w:r>
+        <w:t xml:space="preserve">None of it was on this backlog, and all of it was worth doing. Said plainly so</w:t>
+      </w:r>
+      <w:r>
+        <w:t xml:space="preserve"> </w:t>
+      </w:r>
+      <w:r>
+        <w:t xml:space="preserve">that it is not mistaken for progress against work package 02.</w:t>
+      </w:r>
+    </w:p>
+    <w:p>
+      <w:pPr>
+        <w:pStyle w:val="Compact"/>
+        <w:numPr>
+          <w:numId w:val="1002"/>
+          <w:ilvl w:val="0"/>
+        </w:numPr>
+      </w:pPr>
+      <w:r>
+        <w:t xml:space="preserve">Every download on the published documentation site returned 404. The page was</w:t>
+      </w:r>
+      <w:r>
+        <w:t xml:space="preserve"> </w:t>
+      </w:r>
+      <w:r>
+        <w:t xml:space="preserve">built for one directory layout and published into another. All fourteen now</w:t>
+      </w:r>
+      <w:r>
+        <w:t xml:space="preserve"> </w:t>
+      </w:r>
+      <w:r>
+        <w:t xml:space="preserve">serve, and each document is available as PDF or Word.</w:t>
+      </w:r>
+    </w:p>
+    <w:p>
+      <w:pPr>
+        <w:pStyle w:val="Compact"/>
+        <w:numPr>
+          <w:numId w:val="1002"/>
+          <w:ilvl w:val="0"/>
+        </w:numPr>
+      </w:pPr>
+      <w:r>
+        <w:t xml:space="preserve">The specification set was revised for readability, versioned and dated.</w:t>
+      </w:r>
+    </w:p>
+    <w:p>
+      <w:pPr>
+        <w:pStyle w:val="Compact"/>
+        <w:numPr>
+          <w:numId w:val="1002"/>
+          <w:ilvl w:val="0"/>
+        </w:numPr>
+      </w:pPr>
+      <w:r>
+        <w:t xml:space="preserve">A defect was found and closed: the odometer published kilometres into a signal</w:t>
+      </w:r>
+      <w:r>
+        <w:t xml:space="preserve"> </w:t>
+      </w:r>
+      <w:r>
+        <w:t xml:space="preserve">the catalogue defines in metres, and the display divided by nothing, so the two</w:t>
+      </w:r>
+      <w:r>
+        <w:t xml:space="preserve"> </w:t>
+      </w:r>
+      <w:r>
+        <w:t xml:space="preserve">errors cancelled and the dial looked correct. A new suite check,</w:t>
+      </w:r>
+      <w:r>
+        <w:t xml:space="preserve"> </w:t>
+      </w:r>
+      <w:r>
+        <w:rPr>
+          <w:rStyle w:val="VerbatimChar"/>
+        </w:rPr>
+        <w:t xml:space="preserve">unit-sanity</w:t>
+      </w:r>
+      <w:r>
+        <w:t xml:space="preserve">,</w:t>
+      </w:r>
+      <w:r>
+        <w:t xml:space="preserve"> </w:t>
+      </w:r>
+      <w:r>
+        <w:t xml:space="preserve">fails the build if it recurs.</w:t>
+      </w:r>
+    </w:p>
+    <w:p>
+      <w:pPr>
+        <w:pStyle w:val="FirstParagraph"/>
+      </w:pPr>
+      <w:r>
+        <w:t xml:space="preserve">Against the backlog, week 4 moved item 1 by one check and item 7 by part of a</w:t>
+      </w:r>
+      <w:r>
+        <w:t xml:space="preserve"> </w:t>
+      </w:r>
+      <w:r>
+        <w:t xml:space="preserve">decision. Nothing else.</w:t>
+      </w:r>
+    </w:p>
+    <w:p>
+      <w:pPr>
+        <w:pStyle w:val="Heading2"/>
+      </w:pPr>
+      <w:bookmarkStart w:id="32" w:name="decisions-requested"/>
+      <w:r>
+        <w:t xml:space="preserve">8.3 Decisions requested</w:t>
+      </w:r>
+      <w:bookmarkEnd w:id="32"/>
+    </w:p>
+    <w:p>
+      <w:pPr>
+        <w:pStyle w:val="FirstParagraph"/>
+      </w:pPr>
+      <w:r>
+        <w:t xml:space="preserve">Each one is cheap this week and expensive in week 6.</w:t>
+      </w:r>
+    </w:p>
+    <w:tbl>
+      <w:tblPr>
+        <w:tblStyle w:val="Table"/>
+        <w:tblW w:type="pct" w:w="5000.0"/>
+        <w:tblLook w:firstRow="1"/>
+      </w:tblPr>
+      <w:tblGrid>
+        <w:gridCol w:w="344"/>
+        <w:gridCol w:w="3529"/>
+        <w:gridCol w:w="4046"/>
+      </w:tblGrid>
+      <w:tr>
+        <w:trPr>
+          <w:cnfStyle w:firstRow="1"/>
+        </w:trPr>
+        <w:tc>
+          <w:tcPr>
+            <w:tcBorders>
+              <w:bottom w:val="single"/>
+            </w:tcBorders>
+            <w:vAlign w:val="bottom"/>
+          </w:tcPr>
+          <w:p>
+            <w:pPr>
+              <w:pStyle w:val="Compact"/>
+              <w:jc w:val="left"/>
+            </w:pPr>
+            <w:r>
+              <w:t xml:space="preserve">#</w:t>
+            </w:r>
+          </w:p>
+        </w:tc>
+        <w:tc>
+          <w:tcPr>
+            <w:tcBorders>
+              <w:bottom w:val="single"/>
+            </w:tcBorders>
+            <w:vAlign w:val="bottom"/>
+          </w:tcPr>
+          <w:p>
+            <w:pPr>
+              <w:pStyle w:val="Compact"/>
+              <w:jc w:val="left"/>
+            </w:pPr>
+            <w:r>
+              <w:t xml:space="preserve">Decision</w:t>
+            </w:r>
+          </w:p>
+        </w:tc>
+        <w:tc>
+          <w:tcPr>
+            <w:tcBorders>
+              <w:bottom w:val="single"/>
+            </w:tcBorders>
+            <w:vAlign w:val="bottom"/>
+          </w:tcPr>
+          <w:p>
+            <w:pPr>
+              <w:pStyle w:val="Compact"/>
+              <w:jc w:val="left"/>
+            </w:pPr>
+            <w:r>
+              <w:t xml:space="preserve">Why it cannot wait</w:t>
+            </w:r>
+          </w:p>
+        </w:tc>
+      </w:tr>
+      <w:tr>
+        <w:tc>
+          <w:p>
+            <w:pPr>
+              <w:pStyle w:val="Compact"/>
+              <w:jc w:val="left"/>
+            </w:pPr>
+            <w:r>
+              <w:t xml:space="preserve">1</w:t>
+            </w:r>
+          </w:p>
+        </w:tc>
+        <w:tc>
+          <w:p>
+            <w:pPr>
+              <w:pStyle w:val="Compact"/>
+              <w:jc w:val="left"/>
+            </w:pPr>
+            <w:r>
+              <w:t xml:space="preserve">Cut item 5, Compose staleness</w:t>
+            </w:r>
+          </w:p>
+        </w:tc>
+        <w:tc>
+          <w:p>
+            <w:pPr>
+              <w:pStyle w:val="Compact"/>
+              <w:jc w:val="left"/>
+            </w:pPr>
+            <w:r>
+              <w:t xml:space="preserve">There is no Java, Gradle or Android SDK on the machine, so it would be written blind and untested. Cutting it is what returns slack to the sprint</w:t>
+            </w:r>
+          </w:p>
+        </w:tc>
+      </w:tr>
+      <w:tr>
+        <w:tc>
+          <w:p>
+            <w:pPr>
+              <w:pStyle w:val="Compact"/>
+              <w:jc w:val="left"/>
+            </w:pPr>
+            <w:r>
+              <w:t xml:space="preserve">2</w:t>
+            </w:r>
+          </w:p>
+        </w:tc>
+        <w:tc>
+          <w:p>
+            <w:pPr>
+              <w:pStyle w:val="Compact"/>
+              <w:jc w:val="left"/>
+            </w:pPr>
+            <w:r>
+              <w:t xml:space="preserve">Amend definition of done item 2</w:t>
+            </w:r>
+          </w:p>
+        </w:tc>
+        <w:tc>
+          <w:p>
+            <w:pPr>
+              <w:pStyle w:val="Compact"/>
+              <w:jc w:val="left"/>
+            </w:pPr>
+            <w:r>
+              <w:t xml:space="preserve">It says degraded state on both HMIs. If item 5 is cut, that wording must change before the gate, not at it</w:t>
+            </w:r>
+          </w:p>
+        </w:tc>
+      </w:tr>
+      <w:tr>
+        <w:tc>
+          <w:p>
+            <w:pPr>
+              <w:pStyle w:val="Compact"/>
+              <w:jc w:val="left"/>
+            </w:pPr>
+            <w:r>
+              <w:t xml:space="preserve">3</w:t>
+            </w:r>
+          </w:p>
+        </w:tc>
+        <w:tc>
+          <w:p>
+            <w:pPr>
+              <w:pStyle w:val="Compact"/>
+              <w:jc w:val="left"/>
+            </w:pPr>
+            <w:r>
+              <w:t xml:space="preserve">Fund parity or narrow the benchmark claim</w:t>
+            </w:r>
+          </w:p>
+        </w:tc>
+        <w:tc>
+          <w:p>
+            <w:pPr>
+              <w:pStyle w:val="Compact"/>
+              <w:jc w:val="left"/>
+            </w:pPr>
+            <w:r>
+              <w:t xml:space="preserve">FR-13 is Partial: Flutter subscribes to 28 signals, Compose to 17. The comparison in the deck assumes both consume the same data, and that is no longer true</w:t>
+            </w:r>
+          </w:p>
+        </w:tc>
+      </w:tr>
+      <w:tr>
+        <w:tc>
+          <w:p>
+            <w:pPr>
+              <w:pStyle w:val="Compact"/>
+              <w:jc w:val="left"/>
+            </w:pPr>
+            <w:r>
+              <w:t xml:space="preserve">4</w:t>
+            </w:r>
+          </w:p>
+        </w:tc>
+        <w:tc>
+          <w:p>
+            <w:pPr>
+              <w:pStyle w:val="Compact"/>
+              <w:jc w:val="left"/>
+            </w:pPr>
+            <w:r>
+              <w:t xml:space="preserve">Settle the Flutter SDK pin</w:t>
+            </w:r>
+          </w:p>
+        </w:tc>
+        <w:tc>
+          <w:p>
+            <w:pPr>
+              <w:pStyle w:val="Compact"/>
+              <w:jc w:val="left"/>
+            </w:pPr>
+            <w:r>
+              <w:t xml:space="preserve">Commit the 3.47 upgrade, or revert and pin through FVM. Six hours of work behind a decision open since sprint 1</w:t>
+            </w:r>
+          </w:p>
+        </w:tc>
+      </w:tr>
+      <w:tr>
+        <w:tc>
+          <w:p>
+            <w:pPr>
+              <w:pStyle w:val="Compact"/>
+              <w:jc w:val="left"/>
+            </w:pPr>
+            <w:r>
+              <w:t xml:space="preserve">5</w:t>
+            </w:r>
+          </w:p>
+        </w:tc>
+        <w:tc>
+          <w:p>
+            <w:pPr>
+              <w:pStyle w:val="Compact"/>
+              <w:jc w:val="left"/>
+            </w:pPr>
+            <w:r>
+              <w:t xml:space="preserve">Book the safety and security review</w:t>
+            </w:r>
+          </w:p>
+        </w:tc>
+        <w:tc>
+          <w:p>
+            <w:pPr>
+              <w:pStyle w:val="Compact"/>
+              <w:jc w:val="left"/>
+            </w:pPr>
+            <w:r>
+              <w:t xml:space="preserve">Item 14 needs two external calendars and there are two weeks left. It slips by default</w:t>
+            </w:r>
+          </w:p>
+        </w:tc>
+      </w:tr>
+      <w:tr>
+        <w:tc>
+          <w:p>
+            <w:pPr>
+              <w:pStyle w:val="Compact"/>
+              <w:jc w:val="left"/>
+            </w:pPr>
+            <w:r>
+              <w:t xml:space="preserve">6</w:t>
+            </w:r>
+          </w:p>
+        </w:tc>
+        <w:tc>
+          <w:p>
+            <w:pPr>
+              <w:pStyle w:val="Compact"/>
+              <w:jc w:val="left"/>
+            </w:pPr>
+            <w:r>
+              <w:t xml:space="preserve">Order the target hardware</w:t>
+            </w:r>
+          </w:p>
+        </w:tc>
+        <w:tc>
+          <w:p>
+            <w:pPr>
+              <w:pStyle w:val="Compact"/>
+              <w:jc w:val="left"/>
+            </w:pPr>
+            <w:r>
+              <w:t xml:space="preserve">Work package 03 gates at week 9. Section 7.2 of PULSE-SAD-001 specifies a Raspberry Pi 5 with 8 GB; if a 16 GB board is bought instead, that line changes</w:t>
+            </w:r>
+          </w:p>
+        </w:tc>
+      </w:tr>
+    </w:tbl>
+    <w:p>
+      <w:pPr>
+        <w:pStyle w:val="Heading2"/>
+      </w:pPr>
+      <w:bookmarkStart w:id="33" w:name="proposed-change-to-this-plan"/>
+      <w:r>
+        <w:t xml:space="preserve">8.4 Proposed change to this plan</w:t>
+      </w:r>
+      <w:bookmarkEnd w:id="33"/>
+    </w:p>
+    <w:p>
+      <w:pPr>
+        <w:pStyle w:val="FirstParagraph"/>
+      </w:pPr>
+      <w:r>
+        <w:t xml:space="preserve">Add a checkpoint at the end of week 5, one hour, against this same table. A</w:t>
+      </w:r>
+      <w:r>
+        <w:t xml:space="preserve"> </w:t>
+      </w:r>
+      <w:r>
+        <w:t xml:space="preserve">three-week sprint whose first status point is the gate itself has no room to</w:t>
+      </w:r>
+      <w:r>
+        <w:t xml:space="preserve"> </w:t>
+      </w:r>
+      <w:r>
+        <w:t xml:space="preserve">recover. If week 5 goes the way week 4 did, that should be known on 18</w:t>
+      </w:r>
+      <w:r>
+        <w:t xml:space="preserve"> </w:t>
+      </w:r>
+      <w:r>
+        <w:t xml:space="preserve">September rather than on the morning of the demo.</w:t>
       </w:r>
     </w:p>
     <w:sectPr/>
@@ -2700,6 +4684,109 @@
       <w:start w:val="1"/>
       <w:numFmt w:val="decimal"/>
       <w:lvlText w:val="%9."/>
+      <w:lvlJc w:val="left"/>
+      <w:pPr>
+        <w:tabs>
+          <w:tab w:val="num" w:pos="5760"/>
+        </w:tabs>
+        <w:ind w:left="6240" w:hanging="480"/>
+      </w:pPr>
+    </w:lvl>
+  </w:abstractNum>
+  <w:abstractNum w:abstractNumId="991">
+    <w:nsid w:val="71315dca"/>
+    <w:multiLevelType w:val="multilevel"/>
+    <w:lvl w:ilvl="0">
+      <w:numFmt w:val="bullet"/>
+      <w:lvlText w:val="•"/>
+      <w:lvlJc w:val="left"/>
+      <w:pPr>
+        <w:tabs>
+          <w:tab w:val="num" w:pos="0"/>
+        </w:tabs>
+        <w:ind w:left="480" w:hanging="480"/>
+      </w:pPr>
+    </w:lvl>
+    <w:lvl w:ilvl="1">
+      <w:numFmt w:val="bullet"/>
+      <w:lvlText w:val="–"/>
+      <w:lvlJc w:val="left"/>
+      <w:pPr>
+        <w:tabs>
+          <w:tab w:val="num" w:pos="720"/>
+        </w:tabs>
+        <w:ind w:left="1200" w:hanging="480"/>
+      </w:pPr>
+    </w:lvl>
+    <w:lvl w:ilvl="2">
+      <w:numFmt w:val="bullet"/>
+      <w:lvlText w:val="•"/>
+      <w:lvlJc w:val="left"/>
+      <w:pPr>
+        <w:tabs>
+          <w:tab w:val="num" w:pos="1440"/>
+        </w:tabs>
+        <w:ind w:left="1920" w:hanging="480"/>
+      </w:pPr>
+    </w:lvl>
+    <w:lvl w:ilvl="3">
+      <w:numFmt w:val="bullet"/>
+      <w:lvlText w:val="–"/>
+      <w:lvlJc w:val="left"/>
+      <w:pPr>
+        <w:tabs>
+          <w:tab w:val="num" w:pos="2160"/>
+        </w:tabs>
+        <w:ind w:left="2640" w:hanging="480"/>
+      </w:pPr>
+    </w:lvl>
+    <w:lvl w:ilvl="4">
+      <w:numFmt w:val="bullet"/>
+      <w:lvlText w:val="•"/>
+      <w:lvlJc w:val="left"/>
+      <w:pPr>
+        <w:tabs>
+          <w:tab w:val="num" w:pos="2880"/>
+        </w:tabs>
+        <w:ind w:left="3360" w:hanging="480"/>
+      </w:pPr>
+    </w:lvl>
+    <w:lvl w:ilvl="5">
+      <w:numFmt w:val="bullet"/>
+      <w:lvlText w:val="–"/>
+      <w:lvlJc w:val="left"/>
+      <w:pPr>
+        <w:tabs>
+          <w:tab w:val="num" w:pos="3600"/>
+        </w:tabs>
+        <w:ind w:left="4080" w:hanging="480"/>
+      </w:pPr>
+    </w:lvl>
+    <w:lvl w:ilvl="6">
+      <w:numFmt w:val="bullet"/>
+      <w:lvlText w:val="•"/>
+      <w:lvlJc w:val="left"/>
+      <w:pPr>
+        <w:tabs>
+          <w:tab w:val="num" w:pos="4320"/>
+        </w:tabs>
+        <w:ind w:left="4800" w:hanging="480"/>
+      </w:pPr>
+    </w:lvl>
+    <w:lvl w:ilvl="7">
+      <w:numFmt w:val="bullet"/>
+      <w:lvlText w:val="–"/>
+      <w:lvlJc w:val="left"/>
+      <w:pPr>
+        <w:tabs>
+          <w:tab w:val="num" w:pos="5040"/>
+        </w:tabs>
+        <w:ind w:left="5520" w:hanging="480"/>
+      </w:pPr>
+    </w:lvl>
+    <w:lvl w:ilvl="8">
+      <w:numFmt w:val="bullet"/>
+      <w:lvlText w:val="•"/>
       <w:lvlJc w:val="left"/>
       <w:pPr>
         <w:tabs>
@@ -2744,6 +4831,9 @@
     <w:lvlOverride w:ilvl="8">
       <w:startOverride w:val="1"/>
     </w:lvlOverride>
+  </w:num>
+  <w:num w:numId="1002">
+    <w:abstractNumId w:val="991"/>
   </w:num>
 </w:numbering>
 </file>

</xml_diff>